<commit_message>
Add new ballad from poetry.docx; rename Archive nav to "Log"
Transcribes the poem added 8/4/26 (the maiden of Abersoch ballad)
into photos.js as the newest text entry.

Renames the "Archive" nav link and page title to "Log" across all
four pages -- the URL stays archive.html, only the label changes.

Co-Authored-By: Claude Sonnet 5 <noreply@anthropic.com>
</commit_message>
<xml_diff>
--- a/text/poetry/poetry.docx
+++ b/text/poetry/poetry.docx
@@ -1,6 +1,6 @@
 
 <file path=word/document.xml><?xml version="1.0" encoding="utf-8"?>
-<w:document xmlns:wpc="http://schemas.microsoft.com/office/word/2010/wordprocessingCanvas" xmlns:cx="http://schemas.microsoft.com/office/drawing/2014/chartex" xmlns:cx1="http://schemas.microsoft.com/office/drawing/2015/9/8/chartex" xmlns:cx2="http://schemas.microsoft.com/office/drawing/2015/10/21/chartex" xmlns:cx3="http://schemas.microsoft.com/office/drawing/2016/5/9/chartex" xmlns:cx4="http://schemas.microsoft.com/office/drawing/2016/5/10/chartex" xmlns:cx5="http://schemas.microsoft.com/office/drawing/2016/5/11/chartex" xmlns:cx6="http://schemas.microsoft.com/office/drawing/2016/5/12/chartex" xmlns:cx7="http://schemas.microsoft.com/office/drawing/2016/5/13/chartex" xmlns:cx8="http://schemas.microsoft.com/office/drawing/2016/5/14/chartex" xmlns:mc="http://schemas.openxmlformats.org/markup-compatibility/2006" xmlns:aink="http://schemas.microsoft.com/office/drawing/2016/ink" xmlns:am3d="http://schemas.microsoft.com/office/drawing/2017/model3d" xmlns:o="urn:schemas-microsoft-com:office:office" xmlns:oel="http://schemas.microsoft.com/office/2019/extlst" xmlns:r="http://schemas.openxmlformats.org/officeDocument/2006/relationships" xmlns:m="http://schemas.openxmlformats.org/officeDocument/2006/math" xmlns:v="urn:schemas-microsoft-com:vml" xmlns:wp14="http://schemas.microsoft.com/office/word/2010/wordprocessingDrawing" xmlns:wp="http://schemas.openxmlformats.org/drawingml/2006/wordprocessingDrawing" xmlns:w10="urn:schemas-microsoft-com:office:word" xmlns:w="http://schemas.openxmlformats.org/wordprocessingml/2006/main" xmlns:w14="http://schemas.microsoft.com/office/word/2010/wordml" xmlns:w15="http://schemas.microsoft.com/office/word/2012/wordml" xmlns:w16cex="http://schemas.microsoft.com/office/word/2018/wordml/cex" xmlns:w16cid="http://schemas.microsoft.com/office/word/2016/wordml/cid" xmlns:w16="http://schemas.microsoft.com/office/word/2018/wordml" xmlns:w16du="http://schemas.microsoft.com/office/word/2023/wordml/word16du" xmlns:w16sdtdh="http://schemas.microsoft.com/office/word/2020/wordml/sdtdatahash" xmlns:w16sdtfl="http://schemas.microsoft.com/office/word/2024/wordml/sdtformatlock" xmlns:w16se="http://schemas.microsoft.com/office/word/2015/wordml/symex" xmlns:wpg="http://schemas.microsoft.com/office/word/2010/wordprocessingGroup" xmlns:wpi="http://schemas.microsoft.com/office/word/2010/wordprocessingInk" xmlns:wne="http://schemas.microsoft.com/office/word/2006/wordml" xmlns:wps="http://schemas.microsoft.com/office/word/2010/wordprocessingShape" mc:Ignorable="w14 w15 w16se w16cid w16 w16cex w16sdtdh w16sdtfl w16du wp14">
+<w:document xmlns:wpc="http://schemas.microsoft.com/office/word/2010/wordprocessingCanvas" xmlns:cx="http://schemas.microsoft.com/office/drawing/2014/chartex" xmlns:cx1="http://schemas.microsoft.com/office/drawing/2015/9/8/chartex" xmlns:cx2="http://schemas.microsoft.com/office/drawing/2015/10/21/chartex" xmlns:cx3="http://schemas.microsoft.com/office/drawing/2016/5/9/chartex" xmlns:cx4="http://schemas.microsoft.com/office/drawing/2016/5/10/chartex" xmlns:cx5="http://schemas.microsoft.com/office/drawing/2016/5/11/chartex" xmlns:cx6="http://schemas.microsoft.com/office/drawing/2016/5/12/chartex" xmlns:cx7="http://schemas.microsoft.com/office/drawing/2016/5/13/chartex" xmlns:cx8="http://schemas.microsoft.com/office/drawing/2016/5/14/chartex" xmlns:mc="http://schemas.openxmlformats.org/markup-compatibility/2006" xmlns:aink="http://schemas.microsoft.com/office/drawing/2016/ink" xmlns:am3d="http://schemas.microsoft.com/office/drawing/2017/model3d" xmlns:o="urn:schemas-microsoft-com:office:office" xmlns:oel="http://schemas.microsoft.com/office/2019/extlst" xmlns:r="http://schemas.openxmlformats.org/officeDocument/2006/relationships" xmlns:m="http://schemas.openxmlformats.org/officeDocument/2006/math" xmlns:v="urn:schemas-microsoft-com:vml" xmlns:wp14="http://schemas.microsoft.com/office/word/2010/wordprocessingDrawing" xmlns:wp="http://schemas.openxmlformats.org/drawingml/2006/wordprocessingDrawing" xmlns:w10="urn:schemas-microsoft-com:office:word" xmlns:w="http://schemas.openxmlformats.org/wordprocessingml/2006/main" xmlns:w14="http://schemas.microsoft.com/office/word/2010/wordml" xmlns:w15="http://schemas.microsoft.com/office/word/2012/wordml" xmlns:w16cei="http://schemas.microsoft.com/office/word/2026/wordml/cei" xmlns:w16cex="http://schemas.microsoft.com/office/word/2018/wordml/cex" xmlns:w16cid="http://schemas.microsoft.com/office/word/2016/wordml/cid" xmlns:w16="http://schemas.microsoft.com/office/word/2018/wordml" xmlns:w16du="http://schemas.microsoft.com/office/word/2023/wordml/word16du" xmlns:w16sdtdh="http://schemas.microsoft.com/office/word/2020/wordml/sdtdatahash" xmlns:w16sdtfl="http://schemas.microsoft.com/office/word/2024/wordml/sdtformatlock" xmlns:w16se="http://schemas.microsoft.com/office/word/2015/wordml/symex" xmlns:wpg="http://schemas.microsoft.com/office/word/2010/wordprocessingGroup" xmlns:wpi="http://schemas.microsoft.com/office/word/2010/wordprocessingInk" xmlns:wne="http://schemas.microsoft.com/office/word/2006/wordml" xmlns:wps="http://schemas.microsoft.com/office/word/2010/wordprocessingShape" mc:Ignorable="w14 w15 w16se w16cid w16 w16cex w16sdtdh w16sdtfl w16du wp14">
   <w:body>
     <w:p>
       <w:pPr>
@@ -856,6 +856,289 @@
           <w:rFonts w:ascii="Aparajita" w:hAnsi="Aparajita" w:cs="Aparajita"/>
         </w:rPr>
       </w:pPr>
+      <w:r>
+        <w:rPr>
+          <w:rFonts w:ascii="Aparajita" w:hAnsi="Aparajita" w:cs="Aparajita"/>
+        </w:rPr>
+        <w:t>.</w:t>
+      </w:r>
+    </w:p>
+    <w:p>
+      <w:pPr>
+        <w:spacing w:after="0"/>
+        <w:rPr>
+          <w:rFonts w:ascii="Aparajita" w:hAnsi="Aparajita" w:cs="Aparajita"/>
+        </w:rPr>
+      </w:pPr>
+      <w:r>
+        <w:rPr>
+          <w:rFonts w:ascii="Aparajita" w:hAnsi="Aparajita" w:cs="Aparajita"/>
+        </w:rPr>
+        <w:t>8/4/26</w:t>
+      </w:r>
+    </w:p>
+    <w:p>
+      <w:pPr>
+        <w:spacing w:after="0"/>
+        <w:rPr>
+          <w:rFonts w:ascii="Aparajita" w:hAnsi="Aparajita" w:cs="Aparajita"/>
+        </w:rPr>
+      </w:pPr>
+      <w:r>
+        <w:rPr>
+          <w:rFonts w:ascii="Aparajita" w:hAnsi="Aparajita" w:cs="Aparajita"/>
+        </w:rPr>
+        <w:t>Hark, all maidens, near and distant, and attend to my ballad;</w:t>
+      </w:r>
+      <w:r>
+        <w:rPr>
+          <w:rFonts w:ascii="Aparajita" w:hAnsi="Aparajita" w:cs="Aparajita"/>
+        </w:rPr>
+        <w:br/>
+        <w:t xml:space="preserve">Near </w:t>
+      </w:r>
+      <w:r>
+        <w:rPr>
+          <w:rFonts w:ascii="Aparajita" w:hAnsi="Aparajita" w:cs="Aparajita"/>
+        </w:rPr>
+        <w:t>Abersoch</w:t>
+      </w:r>
+      <w:r>
+        <w:rPr>
+          <w:rFonts w:ascii="Aparajita" w:hAnsi="Aparajita" w:cs="Aparajita"/>
+        </w:rPr>
+        <w:t xml:space="preserve"> dwelled a maiden, she was both tidy and comely.</w:t>
+      </w:r>
+      <w:r>
+        <w:rPr>
+          <w:rFonts w:ascii="Aparajita" w:hAnsi="Aparajita" w:cs="Aparajita"/>
+        </w:rPr>
+        <w:br/>
+        <w:t xml:space="preserve">Her beloved was conscripted and perished in some </w:t>
+      </w:r>
+      <w:r>
+        <w:rPr>
+          <w:rFonts w:ascii="Aparajita" w:hAnsi="Aparajita" w:cs="Aparajita"/>
+        </w:rPr>
+        <w:t>distanced land</w:t>
+      </w:r>
+      <w:r>
+        <w:rPr>
+          <w:rFonts w:ascii="Aparajita" w:hAnsi="Aparajita" w:cs="Aparajita"/>
+        </w:rPr>
+        <w:t>,</w:t>
+      </w:r>
+    </w:p>
+    <w:p>
+      <w:pPr>
+        <w:spacing w:after="0"/>
+        <w:rPr>
+          <w:rFonts w:ascii="Aparajita" w:hAnsi="Aparajita" w:cs="Aparajita"/>
+        </w:rPr>
+      </w:pPr>
+      <w:r>
+        <w:rPr>
+          <w:rFonts w:ascii="Aparajita" w:hAnsi="Aparajita" w:cs="Aparajita"/>
+        </w:rPr>
+        <w:t>And to her beloved she was bound.</w:t>
+      </w:r>
+    </w:p>
+    <w:p>
+      <w:pPr>
+        <w:spacing w:after="0"/>
+        <w:rPr>
+          <w:rFonts w:ascii="Aparajita" w:hAnsi="Aparajita" w:cs="Aparajita"/>
+        </w:rPr>
+      </w:pPr>
+      <w:r>
+        <w:rPr>
+          <w:rFonts w:ascii="Aparajita" w:hAnsi="Aparajita" w:cs="Aparajita"/>
+        </w:rPr>
+        <w:br/>
+        <w:t xml:space="preserve">But ere long you shall learn of </w:t>
+      </w:r>
+      <w:r>
+        <w:rPr>
+          <w:rFonts w:ascii="Aparajita" w:hAnsi="Aparajita" w:cs="Aparajita"/>
+        </w:rPr>
+        <w:t>her</w:t>
+      </w:r>
+      <w:r>
+        <w:rPr>
+          <w:rFonts w:ascii="Aparajita" w:hAnsi="Aparajita" w:cs="Aparajita"/>
+        </w:rPr>
+        <w:t xml:space="preserve"> downfall.</w:t>
+      </w:r>
+    </w:p>
+    <w:p>
+      <w:pPr>
+        <w:spacing w:after="0"/>
+        <w:rPr>
+          <w:rFonts w:ascii="Aparajita" w:hAnsi="Aparajita" w:cs="Aparajita"/>
+        </w:rPr>
+      </w:pPr>
+      <w:r>
+        <w:rPr>
+          <w:rFonts w:ascii="Aparajita" w:hAnsi="Aparajita" w:cs="Aparajita"/>
+        </w:rPr>
+        <w:t xml:space="preserve">Although her spirit never faltered, it was </w:t>
+      </w:r>
+      <w:r>
+        <w:rPr>
+          <w:rFonts w:ascii="Aparajita" w:hAnsi="Aparajita" w:cs="Aparajita"/>
+        </w:rPr>
+        <w:t xml:space="preserve">those </w:t>
+      </w:r>
+      <w:r>
+        <w:rPr>
+          <w:rFonts w:ascii="Aparajita" w:hAnsi="Aparajita" w:cs="Aparajita"/>
+        </w:rPr>
+        <w:t xml:space="preserve">turbulent </w:t>
+      </w:r>
+      <w:r>
+        <w:rPr>
+          <w:rFonts w:ascii="Aparajita" w:hAnsi="Aparajita" w:cs="Aparajita"/>
+        </w:rPr>
+        <w:t>winds</w:t>
+      </w:r>
+      <w:r>
+        <w:rPr>
+          <w:rFonts w:ascii="Aparajita" w:hAnsi="Aparajita" w:cs="Aparajita"/>
+        </w:rPr>
+        <w:t xml:space="preserve"> and a winter tempest</w:t>
+      </w:r>
+      <w:r>
+        <w:rPr>
+          <w:rFonts w:ascii="Aparajita" w:hAnsi="Aparajita" w:cs="Aparajita"/>
+        </w:rPr>
+        <w:br/>
+        <w:t>That overcame this lovely maiden, this</w:t>
+      </w:r>
+      <w:r>
+        <w:rPr>
+          <w:rFonts w:ascii="Aparajita" w:hAnsi="Aparajita" w:cs="Aparajita"/>
+        </w:rPr>
+        <w:t xml:space="preserve"> dearest </w:t>
+      </w:r>
+      <w:r>
+        <w:rPr>
+          <w:rFonts w:ascii="Aparajita" w:hAnsi="Aparajita" w:cs="Aparajita"/>
+        </w:rPr>
+        <w:t>pale-faced visage.</w:t>
+      </w:r>
+      <w:r>
+        <w:rPr>
+          <w:rFonts w:ascii="Aparajita" w:hAnsi="Aparajita" w:cs="Aparajita"/>
+        </w:rPr>
+        <w:br/>
+      </w:r>
+    </w:p>
+    <w:p>
+      <w:pPr>
+        <w:spacing w:after="0"/>
+        <w:rPr>
+          <w:rFonts w:ascii="Aparajita" w:hAnsi="Aparajita" w:cs="Aparajita"/>
+        </w:rPr>
+      </w:pPr>
+      <w:r>
+        <w:rPr>
+          <w:rFonts w:ascii="Aparajita" w:hAnsi="Aparajita" w:cs="Aparajita"/>
+        </w:rPr>
+        <w:lastRenderedPageBreak/>
+        <w:t xml:space="preserve">From </w:t>
+      </w:r>
+      <w:r>
+        <w:rPr>
+          <w:rFonts w:ascii="Aparajita" w:hAnsi="Aparajita" w:cs="Aparajita"/>
+        </w:rPr>
+        <w:t>field to field</w:t>
+      </w:r>
+      <w:r>
+        <w:rPr>
+          <w:rFonts w:ascii="Aparajita" w:hAnsi="Aparajita" w:cs="Aparajita"/>
+        </w:rPr>
+        <w:t xml:space="preserve"> she navigated freely, to places she had frequented often;</w:t>
+      </w:r>
+      <w:r>
+        <w:rPr>
+          <w:rFonts w:ascii="Aparajita" w:hAnsi="Aparajita" w:cs="Aparajita"/>
+        </w:rPr>
+        <w:br/>
+        <w:t>Her grip slipped and she plunged downwards; she placidly bid this world adieu.</w:t>
+      </w:r>
+    </w:p>
+    <w:p>
+      <w:pPr>
+        <w:spacing w:after="0"/>
+        <w:rPr>
+          <w:rFonts w:ascii="Aparajita" w:hAnsi="Aparajita" w:cs="Aparajita"/>
+        </w:rPr>
+      </w:pPr>
+      <w:r>
+        <w:rPr>
+          <w:rFonts w:ascii="Aparajita" w:hAnsi="Aparajita" w:cs="Aparajita"/>
+        </w:rPr>
+        <w:br/>
+        <w:t>May the willows sway about her</w:t>
+      </w:r>
+      <w:r>
+        <w:rPr>
+          <w:rFonts w:ascii="Aparajita" w:hAnsi="Aparajita" w:cs="Aparajita"/>
+        </w:rPr>
+        <w:t xml:space="preserve">, </w:t>
+      </w:r>
+      <w:r>
+        <w:rPr>
+          <w:rFonts w:ascii="Aparajita" w:hAnsi="Aparajita" w:cs="Aparajita"/>
+        </w:rPr>
+        <w:t>and about the cultivated laurels,</w:t>
+      </w:r>
+      <w:r>
+        <w:rPr>
+          <w:rFonts w:ascii="Aparajita" w:hAnsi="Aparajita" w:cs="Aparajita"/>
+        </w:rPr>
+        <w:br/>
+        <w:t xml:space="preserve">May the sweet roses blossom at the extremities of the </w:t>
+      </w:r>
+      <w:r>
+        <w:rPr>
+          <w:rFonts w:ascii="Aparajita" w:hAnsi="Aparajita" w:cs="Aparajita"/>
+        </w:rPr>
+        <w:t>maiden; for one</w:t>
+      </w:r>
+      <w:r>
+        <w:rPr>
+          <w:rFonts w:ascii="Aparajita" w:hAnsi="Aparajita" w:cs="Aparajita"/>
+        </w:rPr>
+        <w:t xml:space="preserve"> was brave.</w:t>
+      </w:r>
+      <w:r>
+        <w:rPr>
+          <w:rFonts w:ascii="Aparajita" w:hAnsi="Aparajita" w:cs="Aparajita"/>
+        </w:rPr>
+        <w:br/>
+        <w:t>Her physical form rests buried in the soil, allow us trust her spirit is in ecstasy.</w:t>
+      </w:r>
+      <w:r>
+        <w:rPr>
+          <w:rFonts w:ascii="Aparajita" w:hAnsi="Aparajita" w:cs="Aparajita"/>
+        </w:rPr>
+        <w:br/>
+        <w:t>let us trust her spirit is in bliss.</w:t>
+      </w:r>
+      <w:r>
+        <w:rPr>
+          <w:rFonts w:ascii="Aparajita" w:hAnsi="Aparajita" w:cs="Aparajita"/>
+        </w:rPr>
+        <w:br/>
+        <w:t xml:space="preserve">Shed a single tear as a definitive parting to the nomadic </w:t>
+      </w:r>
+      <w:r>
+        <w:rPr>
+          <w:rFonts w:ascii="Aparajita" w:hAnsi="Aparajita" w:cs="Aparajita"/>
+        </w:rPr>
+        <w:t>sparrow</w:t>
+      </w:r>
       <w:r>
         <w:rPr>
           <w:rFonts w:ascii="Aparajita" w:hAnsi="Aparajita" w:cs="Aparajita"/>
@@ -1797,6 +2080,17 @@
       <w:spacing w:val="5"/>
     </w:rPr>
   </w:style>
+  <w:style w:type="paragraph" w:styleId="NormalWeb">
+    <w:name w:val="Normal (Web)"/>
+    <w:basedOn w:val="Normal"/>
+    <w:uiPriority w:val="99"/>
+    <w:semiHidden/>
+    <w:unhideWhenUsed/>
+    <w:rsid w:val="00F904A8"/>
+    <w:rPr>
+      <w:rFonts w:ascii="Times New Roman" w:hAnsi="Times New Roman" w:cs="Times New Roman"/>
+    </w:rPr>
+  </w:style>
 </w:styles>
 </file>
 

</xml_diff>

<commit_message>
Add six new poems from poetry.docx, revise the Abersoch ballad
The ballad (2026-08-04) gained a new second stanza and a few line
edits since it was first transcribed; updated to match. New entries,
newest first: 2026-08-02 (prose), two from 2026-08-01, 2026-07-17,
2026-07-16, and 2026-07-04.

One of the 2026-08-01 entries ("I'll have nobility gold/white...")
had no date of its own in the source doc -- it sits between the dated
8/1 poem and the next dated entry (7/17), so it's dated 8/1 on the
assumption it's from the same session. Worth confirming.

Also ignore Word's own ~$ lock file and ~WRL*.tmp temp file, both of
which appear in the working tree while poetry.docx is open and
shouldn't be tracked.

Co-Authored-By: Claude Sonnet 5 <noreply@anthropic.com>
</commit_message>
<xml_diff>
--- a/text/poetry/poetry.docx
+++ b/text/poetry/poetry.docx
@@ -888,7 +888,19 @@
         <w:rPr>
           <w:rFonts w:ascii="Aparajita" w:hAnsi="Aparajita" w:cs="Aparajita"/>
         </w:rPr>
-        <w:t>Hark, all maidens, near and distant, and attend to my ballad;</w:t>
+        <w:t>Hark, all</w:t>
+      </w:r>
+      <w:r>
+        <w:rPr>
+          <w:rFonts w:ascii="Aparajita" w:hAnsi="Aparajita" w:cs="Aparajita"/>
+        </w:rPr>
+        <w:t xml:space="preserve"> maids</w:t>
+      </w:r>
+      <w:r>
+        <w:rPr>
+          <w:rFonts w:ascii="Aparajita" w:hAnsi="Aparajita" w:cs="Aparajita"/>
+        </w:rPr>
+        <w:t>, near and distant, and attend to my ballad;</w:t>
       </w:r>
       <w:r>
         <w:rPr>
@@ -950,6 +962,90 @@
           <w:rFonts w:ascii="Aparajita" w:hAnsi="Aparajita" w:cs="Aparajita"/>
         </w:rPr>
       </w:pPr>
+    </w:p>
+    <w:p>
+      <w:pPr>
+        <w:spacing w:after="0"/>
+        <w:rPr>
+          <w:rFonts w:ascii="Aparajita" w:hAnsi="Aparajita" w:cs="Aparajita"/>
+        </w:rPr>
+      </w:pPr>
+      <w:r>
+        <w:rPr>
+          <w:rFonts w:ascii="Aparajita" w:hAnsi="Aparajita" w:cs="Aparajita"/>
+        </w:rPr>
+        <w:t xml:space="preserve">Clad in crimson and linen pale, much </w:t>
+      </w:r>
+      <w:r>
+        <w:rPr>
+          <w:rFonts w:ascii="Aparajita" w:hAnsi="Aparajita" w:cs="Aparajita"/>
+        </w:rPr>
+        <w:t>avowed of</w:t>
+      </w:r>
+      <w:r>
+        <w:rPr>
+          <w:rFonts w:ascii="Aparajita" w:hAnsi="Aparajita" w:cs="Aparajita"/>
+        </w:rPr>
+        <w:t xml:space="preserve"> prim and hale,</w:t>
+      </w:r>
+      <w:r>
+        <w:rPr>
+          <w:rFonts w:ascii="Aparajita" w:hAnsi="Aparajita" w:cs="Aparajita"/>
+        </w:rPr>
+        <w:br/>
+        <w:t xml:space="preserve">The </w:t>
+      </w:r>
+      <w:r>
+        <w:rPr>
+          <w:rFonts w:ascii="Aparajita" w:hAnsi="Aparajita" w:cs="Aparajita"/>
+        </w:rPr>
+        <w:t>road</w:t>
+      </w:r>
+      <w:r>
+        <w:rPr>
+          <w:rFonts w:ascii="Aparajita" w:hAnsi="Aparajita" w:cs="Aparajita"/>
+        </w:rPr>
+        <w:t xml:space="preserve"> was the soul's elation of the</w:t>
+      </w:r>
+      <w:r>
+        <w:rPr>
+          <w:rFonts w:ascii="Aparajita" w:hAnsi="Aparajita" w:cs="Aparajita"/>
+        </w:rPr>
+        <w:t xml:space="preserve"> maiden’s direction</w:t>
+      </w:r>
+      <w:r>
+        <w:rPr>
+          <w:rFonts w:ascii="Aparajita" w:hAnsi="Aparajita" w:cs="Aparajita"/>
+        </w:rPr>
+        <w:t>.</w:t>
+      </w:r>
+      <w:r>
+        <w:rPr>
+          <w:rFonts w:ascii="Aparajita" w:hAnsi="Aparajita" w:cs="Aparajita"/>
+        </w:rPr>
+        <w:br/>
+        <w:t xml:space="preserve">From </w:t>
+      </w:r>
+      <w:r>
+        <w:rPr>
+          <w:rFonts w:ascii="Aparajita" w:hAnsi="Aparajita" w:cs="Aparajita"/>
+        </w:rPr>
+        <w:t>street to street</w:t>
+      </w:r>
+      <w:r>
+        <w:rPr>
+          <w:rFonts w:ascii="Aparajita" w:hAnsi="Aparajita" w:cs="Aparajita"/>
+        </w:rPr>
+        <w:t xml:space="preserve"> she ventures forth; she confronts all perils, scorns all wrath,</w:t>
+      </w:r>
+    </w:p>
+    <w:p>
+      <w:pPr>
+        <w:spacing w:after="0"/>
+        <w:rPr>
+          <w:rFonts w:ascii="Aparajita" w:hAnsi="Aparajita" w:cs="Aparajita"/>
+        </w:rPr>
+      </w:pPr>
       <w:r>
         <w:rPr>
           <w:rFonts w:ascii="Aparajita" w:hAnsi="Aparajita" w:cs="Aparajita"/>
@@ -981,6 +1077,7 @@
         <w:rPr>
           <w:rFonts w:ascii="Aparajita" w:hAnsi="Aparajita" w:cs="Aparajita"/>
         </w:rPr>
+        <w:lastRenderedPageBreak/>
         <w:t xml:space="preserve">Although her spirit never faltered, it was </w:t>
       </w:r>
       <w:r>
@@ -1044,101 +1141,970 @@
         <w:rPr>
           <w:rFonts w:ascii="Aparajita" w:hAnsi="Aparajita" w:cs="Aparajita"/>
         </w:rPr>
+        <w:t xml:space="preserve">From </w:t>
+      </w:r>
+      <w:r>
+        <w:rPr>
+          <w:rFonts w:ascii="Aparajita" w:hAnsi="Aparajita" w:cs="Aparajita"/>
+        </w:rPr>
+        <w:t>field to field</w:t>
+      </w:r>
+      <w:r>
+        <w:rPr>
+          <w:rFonts w:ascii="Aparajita" w:hAnsi="Aparajita" w:cs="Aparajita"/>
+        </w:rPr>
+        <w:t xml:space="preserve"> she navigated freely, to places she had frequented often;</w:t>
+      </w:r>
+      <w:r>
+        <w:rPr>
+          <w:rFonts w:ascii="Aparajita" w:hAnsi="Aparajita" w:cs="Aparajita"/>
+        </w:rPr>
+        <w:br/>
+        <w:t xml:space="preserve">Her grip slipped and she plunged downwards; she </w:t>
+      </w:r>
+      <w:r>
+        <w:rPr>
+          <w:rFonts w:ascii="Aparajita" w:hAnsi="Aparajita" w:cs="Aparajita"/>
+        </w:rPr>
+        <w:t>unjustly</w:t>
+      </w:r>
+      <w:r>
+        <w:rPr>
+          <w:rFonts w:ascii="Aparajita" w:hAnsi="Aparajita" w:cs="Aparajita"/>
+        </w:rPr>
+        <w:t xml:space="preserve"> bid this world adieu.</w:t>
+      </w:r>
+    </w:p>
+    <w:p>
+      <w:pPr>
+        <w:spacing w:after="0"/>
+        <w:rPr>
+          <w:rFonts w:ascii="Aparajita" w:hAnsi="Aparajita" w:cs="Aparajita"/>
+        </w:rPr>
+      </w:pPr>
+      <w:r>
+        <w:rPr>
+          <w:rFonts w:ascii="Aparajita" w:hAnsi="Aparajita" w:cs="Aparajita"/>
+        </w:rPr>
+        <w:br/>
+        <w:t>May the willows sway about her</w:t>
+      </w:r>
+      <w:r>
+        <w:rPr>
+          <w:rFonts w:ascii="Aparajita" w:hAnsi="Aparajita" w:cs="Aparajita"/>
+        </w:rPr>
+        <w:t xml:space="preserve">, </w:t>
+      </w:r>
+      <w:r>
+        <w:rPr>
+          <w:rFonts w:ascii="Aparajita" w:hAnsi="Aparajita" w:cs="Aparajita"/>
+        </w:rPr>
+        <w:t>and about the cultivated laurels,</w:t>
+      </w:r>
+      <w:r>
+        <w:rPr>
+          <w:rFonts w:ascii="Aparajita" w:hAnsi="Aparajita" w:cs="Aparajita"/>
+        </w:rPr>
+        <w:br/>
+        <w:t xml:space="preserve">May the sweet roses blossom at the extremities of the </w:t>
+      </w:r>
+      <w:r>
+        <w:rPr>
+          <w:rFonts w:ascii="Aparajita" w:hAnsi="Aparajita" w:cs="Aparajita"/>
+        </w:rPr>
+        <w:t>maiden; for one</w:t>
+      </w:r>
+      <w:r>
+        <w:rPr>
+          <w:rFonts w:ascii="Aparajita" w:hAnsi="Aparajita" w:cs="Aparajita"/>
+        </w:rPr>
+        <w:t xml:space="preserve"> was brave.</w:t>
+      </w:r>
+      <w:r>
+        <w:rPr>
+          <w:rFonts w:ascii="Aparajita" w:hAnsi="Aparajita" w:cs="Aparajita"/>
+        </w:rPr>
+        <w:br/>
+        <w:t>Her physical form rests buried in the soil, allow us trust her spirit is in ecstasy.</w:t>
+      </w:r>
+      <w:r>
+        <w:rPr>
+          <w:rFonts w:ascii="Aparajita" w:hAnsi="Aparajita" w:cs="Aparajita"/>
+        </w:rPr>
+        <w:br/>
+        <w:t>let us trust her spirit is in bliss.</w:t>
+      </w:r>
+      <w:r>
+        <w:rPr>
+          <w:rFonts w:ascii="Aparajita" w:hAnsi="Aparajita" w:cs="Aparajita"/>
+        </w:rPr>
+        <w:br/>
+        <w:t xml:space="preserve">Shed a single tear as a definitive parting to the nomadic </w:t>
+      </w:r>
+      <w:r>
+        <w:rPr>
+          <w:rFonts w:ascii="Aparajita" w:hAnsi="Aparajita" w:cs="Aparajita"/>
+        </w:rPr>
+        <w:t>weaverbird</w:t>
+      </w:r>
+      <w:r>
+        <w:rPr>
+          <w:rFonts w:ascii="Aparajita" w:hAnsi="Aparajita" w:cs="Aparajita"/>
+        </w:rPr>
+        <w:t>.</w:t>
+      </w:r>
+    </w:p>
+    <w:p>
+      <w:pPr>
+        <w:spacing w:after="0"/>
+        <w:rPr>
+          <w:rFonts w:ascii="Aparajita" w:hAnsi="Aparajita" w:cs="Aparajita"/>
+        </w:rPr>
+      </w:pPr>
+      <w:r>
+        <w:rPr>
+          <w:rFonts w:ascii="Aparajita" w:hAnsi="Aparajita" w:cs="Aparajita"/>
+        </w:rPr>
+        <w:t>.</w:t>
+      </w:r>
+    </w:p>
+    <w:p>
+      <w:pPr>
+        <w:spacing w:after="0"/>
+        <w:rPr>
+          <w:rFonts w:ascii="Aparajita" w:hAnsi="Aparajita" w:cs="Aparajita"/>
+        </w:rPr>
+      </w:pPr>
+      <w:r>
+        <w:rPr>
+          <w:rFonts w:ascii="Aparajita" w:hAnsi="Aparajita" w:cs="Aparajita"/>
+        </w:rPr>
+        <w:t>8/1/26</w:t>
+      </w:r>
+    </w:p>
+    <w:p>
+      <w:pPr>
+        <w:spacing w:after="0"/>
+        <w:rPr>
+          <w:rFonts w:ascii="Aparajita" w:hAnsi="Aparajita" w:cs="Aparajita"/>
+        </w:rPr>
+      </w:pPr>
+      <w:r>
+        <w:rPr>
+          <w:rFonts w:ascii="Aparajita" w:hAnsi="Aparajita" w:cs="Aparajita"/>
+        </w:rPr>
+        <w:t>The interior is the common ground place all must convene,</w:t>
+      </w:r>
+      <w:r>
+        <w:rPr>
+          <w:rFonts w:ascii="Aparajita" w:hAnsi="Aparajita" w:cs="Aparajita"/>
+        </w:rPr>
+        <w:br/>
+        <w:t xml:space="preserve">Two together </w:t>
+      </w:r>
+      <w:r>
+        <w:rPr>
+          <w:rFonts w:ascii="Aparajita" w:hAnsi="Aparajita" w:cs="Aparajita"/>
+        </w:rPr>
+        <w:t>forested</w:t>
+      </w:r>
+      <w:r>
+        <w:rPr>
+          <w:rFonts w:ascii="Aparajita" w:hAnsi="Aparajita" w:cs="Aparajita"/>
+        </w:rPr>
+        <w:t xml:space="preserve"> and destitute, also small and grand;</w:t>
+      </w:r>
+      <w:r>
+        <w:rPr>
+          <w:rFonts w:ascii="Aparajita" w:hAnsi="Aparajita" w:cs="Aparajita"/>
+        </w:rPr>
+        <w:br/>
+        <w:t>If life were a possession,</w:t>
+      </w:r>
+      <w:r>
+        <w:rPr>
+          <w:rFonts w:ascii="Aparajita" w:hAnsi="Aparajita" w:cs="Aparajita"/>
+        </w:rPr>
+        <w:br/>
+        <w:t>I’ll give you all my wealth in store</w:t>
+      </w:r>
+      <w:r>
+        <w:rPr>
+          <w:rFonts w:ascii="Aparajita" w:hAnsi="Aparajita" w:cs="Aparajita"/>
+        </w:rPr>
+        <w:t>.</w:t>
+      </w:r>
+    </w:p>
+    <w:p>
+      <w:pPr>
+        <w:spacing w:after="0"/>
+        <w:rPr>
+          <w:rFonts w:ascii="Aparajita" w:hAnsi="Aparajita" w:cs="Aparajita"/>
+        </w:rPr>
+      </w:pPr>
+      <w:r>
+        <w:rPr>
+          <w:rFonts w:ascii="Aparajita" w:hAnsi="Aparajita" w:cs="Aparajita"/>
+        </w:rPr>
+        <w:t>.</w:t>
+      </w:r>
+    </w:p>
+    <w:p>
+      <w:pPr>
+        <w:spacing w:after="0"/>
+        <w:rPr>
+          <w:rFonts w:ascii="Aparajita" w:hAnsi="Aparajita" w:cs="Aparajita"/>
+        </w:rPr>
+      </w:pPr>
+      <w:r>
+        <w:rPr>
+          <w:rFonts w:ascii="Aparajita" w:hAnsi="Aparajita" w:cs="Aparajita"/>
+        </w:rPr>
+        <w:t xml:space="preserve">I'll have nobility gold/white, I'll have nobility pearl-cream-gold, </w:t>
+      </w:r>
+      <w:r>
+        <w:rPr>
+          <w:rFonts w:ascii="Aparajita" w:hAnsi="Aparajita" w:cs="Aparajita"/>
+        </w:rPr>
+        <w:br/>
+        <w:t xml:space="preserve">I wantth nobility costly rich robins to wear. </w:t>
+      </w:r>
+      <w:r>
+        <w:rPr>
+          <w:rFonts w:ascii="Aparajita" w:hAnsi="Aparajita" w:cs="Aparajita"/>
+        </w:rPr>
+        <w:br/>
+        <w:t xml:space="preserve">I cannot spare you a little whim </w:t>
+      </w:r>
+      <w:r>
+        <w:rPr>
+          <w:rFonts w:ascii="Aparajita" w:hAnsi="Aparajita" w:cs="Aparajita"/>
+        </w:rPr>
+        <w:br/>
+        <w:t xml:space="preserve">Nor give you timekeeping your lifebelt to amend, </w:t>
+      </w:r>
+      <w:r>
+        <w:rPr>
+          <w:rFonts w:ascii="Aparajita" w:hAnsi="Aparajita" w:cs="Aparajita"/>
+        </w:rPr>
+        <w:br/>
+        <w:t>Nor give you timekeeping your lifebelt to amend</w:t>
+      </w:r>
+    </w:p>
+    <w:p>
+      <w:pPr>
+        <w:spacing w:after="0"/>
+        <w:rPr>
+          <w:rFonts w:ascii="Aparajita" w:hAnsi="Aparajita" w:cs="Aparajita"/>
+        </w:rPr>
+      </w:pPr>
+      <w:r>
+        <w:rPr>
+          <w:rFonts w:ascii="Aparajita" w:hAnsi="Aparajita" w:cs="Aparajita"/>
+        </w:rPr>
+        <w:t>.</w:t>
+      </w:r>
+    </w:p>
+    <w:p>
+      <w:pPr>
+        <w:spacing w:after="0"/>
+        <w:rPr>
+          <w:rFonts w:ascii="Aparajita" w:hAnsi="Aparajita" w:cs="Aparajita"/>
+        </w:rPr>
+      </w:pPr>
+      <w:r>
+        <w:rPr>
+          <w:rFonts w:ascii="Aparajita" w:hAnsi="Aparajita" w:cs="Aparajita"/>
+        </w:rPr>
+        <w:t>7/17/26</w:t>
+      </w:r>
+    </w:p>
+    <w:p>
+      <w:pPr>
+        <w:spacing w:after="0"/>
+        <w:rPr>
+          <w:rFonts w:ascii="Aparajita" w:hAnsi="Aparajita" w:cs="Aparajita"/>
+        </w:rPr>
+      </w:pPr>
+      <w:r>
+        <w:rPr>
+          <w:rFonts w:ascii="Aparajita" w:hAnsi="Aparajita" w:cs="Aparajita"/>
+        </w:rPr>
+        <w:t xml:space="preserve">As alone All  </w:t>
+      </w:r>
+    </w:p>
+    <w:p>
+      <w:pPr>
+        <w:spacing w:after="0"/>
+        <w:rPr>
+          <w:rFonts w:ascii="Aparajita" w:hAnsi="Aparajita" w:cs="Aparajita"/>
+        </w:rPr>
+      </w:pPr>
+      <w:r>
+        <w:rPr>
+          <w:rFonts w:ascii="Aparajita" w:hAnsi="Aparajita" w:cs="Aparajita"/>
+        </w:rPr>
+        <w:t xml:space="preserve">merry  </w:t>
+      </w:r>
+    </w:p>
+    <w:p>
+      <w:pPr>
+        <w:spacing w:after="0"/>
+        <w:rPr>
+          <w:rFonts w:ascii="Aparajita" w:hAnsi="Aparajita" w:cs="Aparajita"/>
+        </w:rPr>
+      </w:pPr>
+      <w:r>
+        <w:rPr>
+          <w:rFonts w:ascii="Aparajita" w:hAnsi="Aparajita" w:cs="Aparajita"/>
+        </w:rPr>
+        <w:t xml:space="preserve">lambs did  </w:t>
+      </w:r>
+    </w:p>
+    <w:p>
+      <w:pPr>
+        <w:spacing w:after="0"/>
+        <w:rPr>
+          <w:rFonts w:ascii="Aparajita" w:hAnsi="Aparajita" w:cs="Aparajita"/>
+        </w:rPr>
+      </w:pPr>
+      <w:r>
+        <w:rPr>
+          <w:rFonts w:ascii="Aparajita" w:hAnsi="Aparajita" w:cs="Aparajita"/>
+        </w:rPr>
+        <w:t xml:space="preserve">I the  </w:t>
+      </w:r>
+    </w:p>
+    <w:p>
+      <w:pPr>
+        <w:spacing w:after="0"/>
+        <w:rPr>
+          <w:rFonts w:ascii="Aparajita" w:hAnsi="Aparajita" w:cs="Aparajita"/>
+        </w:rPr>
+      </w:pPr>
+      <w:r>
+        <w:rPr>
+          <w:rFonts w:ascii="Aparajita" w:hAnsi="Aparajita" w:cs="Aparajita"/>
+        </w:rPr>
+        <w:t xml:space="preserve">birds met alone  </w:t>
+      </w:r>
+    </w:p>
+    <w:p>
+      <w:pPr>
+        <w:spacing w:after="0"/>
+        <w:rPr>
+          <w:rFonts w:ascii="Aparajita" w:hAnsi="Aparajita" w:cs="Aparajita"/>
+        </w:rPr>
+      </w:pPr>
+      <w:r>
+        <w:rPr>
+          <w:rFonts w:ascii="Aparajita" w:hAnsi="Aparajita" w:cs="Aparajita"/>
+        </w:rPr>
+        <w:t xml:space="preserve">the </w:t>
+      </w:r>
+      <w:r>
+        <w:rPr>
+          <w:rFonts w:ascii="Aparajita" w:hAnsi="Aparajita" w:cs="Aparajita"/>
+        </w:rPr>
+        <w:t xml:space="preserve">month </w:t>
+      </w:r>
+      <w:r>
+        <w:rPr>
+          <w:rFonts w:ascii="Aparajita" w:hAnsi="Aparajita" w:cs="Aparajita"/>
+        </w:rPr>
+        <w:t>sang, walked</w:t>
+      </w:r>
+      <w:r>
+        <w:rPr>
+          <w:rFonts w:ascii="Aparajita" w:hAnsi="Aparajita" w:cs="Aparajita"/>
+        </w:rPr>
+        <w:t xml:space="preserve">  </w:t>
+      </w:r>
+    </w:p>
+    <w:p>
+      <w:pPr>
+        <w:spacing w:after="0"/>
+        <w:rPr>
+          <w:rFonts w:ascii="Aparajita" w:hAnsi="Aparajita" w:cs="Aparajita"/>
+        </w:rPr>
+      </w:pPr>
+      <w:r>
+        <w:rPr>
+          <w:rFonts w:ascii="Aparajita" w:hAnsi="Aparajita" w:cs="Aparajita"/>
+        </w:rPr>
+        <w:t xml:space="preserve">alone As  </w:t>
+      </w:r>
+    </w:p>
+    <w:p>
+      <w:pPr>
+        <w:spacing w:after="0"/>
+        <w:rPr>
+          <w:rFonts w:ascii="Aparajita" w:hAnsi="Aparajita" w:cs="Aparajita"/>
+        </w:rPr>
+      </w:pPr>
+      <w:r>
+        <w:rPr>
+          <w:rFonts w:ascii="Aparajita" w:hAnsi="Aparajita" w:cs="Aparajita"/>
+        </w:rPr>
+        <w:t>the</w:t>
+      </w:r>
+    </w:p>
+    <w:p>
+      <w:pPr>
+        <w:spacing w:after="0"/>
+        <w:rPr>
+          <w:rFonts w:ascii="Aparajita" w:hAnsi="Aparajita" w:cs="Aparajita"/>
+        </w:rPr>
+      </w:pPr>
+      <w:r>
+        <w:rPr>
+          <w:rFonts w:ascii="Aparajita" w:hAnsi="Aparajita" w:cs="Aparajita"/>
+        </w:rPr>
+        <w:t xml:space="preserve">way </w:t>
+      </w:r>
+      <w:r>
+        <w:rPr>
+          <w:rFonts w:ascii="Aparajita" w:hAnsi="Aparajita" w:cs="Aparajita"/>
+        </w:rPr>
+        <w:t xml:space="preserve">the </w:t>
+      </w:r>
+      <w:r>
+        <w:rPr>
+          <w:rFonts w:ascii="Aparajita" w:hAnsi="Aparajita" w:cs="Aparajita"/>
+        </w:rPr>
+        <w:t>month bi</w:t>
+      </w:r>
+      <w:r>
+        <w:rPr>
+          <w:rFonts w:ascii="Aparajita" w:hAnsi="Aparajita" w:cs="Aparajita"/>
+        </w:rPr>
+        <w:t>ds farewell</w:t>
+      </w:r>
+      <w:r>
+        <w:rPr>
+          <w:rFonts w:ascii="Aparajita" w:hAnsi="Aparajita" w:cs="Aparajita"/>
+        </w:rPr>
+        <w:t xml:space="preserve"> </w:t>
+      </w:r>
+    </w:p>
+    <w:p>
+      <w:pPr>
+        <w:spacing w:after="0"/>
+        <w:rPr>
+          <w:rFonts w:ascii="Aparajita" w:hAnsi="Aparajita" w:cs="Aparajita"/>
+        </w:rPr>
+      </w:pPr>
+      <w:r>
+        <w:rPr>
+          <w:rFonts w:ascii="Aparajita" w:hAnsi="Aparajita" w:cs="Aparajita"/>
+        </w:rPr>
+        <w:t>.</w:t>
+      </w:r>
+    </w:p>
+    <w:p>
+      <w:pPr>
+        <w:spacing w:after="0"/>
+        <w:rPr>
+          <w:rFonts w:ascii="Aparajita" w:hAnsi="Aparajita" w:cs="Aparajita"/>
+        </w:rPr>
+      </w:pPr>
+      <w:r>
+        <w:rPr>
+          <w:rFonts w:ascii="Aparajita" w:hAnsi="Aparajita" w:cs="Aparajita"/>
+        </w:rPr>
+        <w:t>7/16/26</w:t>
+      </w:r>
+    </w:p>
+    <w:p>
+      <w:pPr>
+        <w:spacing w:after="0"/>
+        <w:rPr>
+          <w:rFonts w:ascii="Aparajita" w:hAnsi="Aparajita" w:cs="Aparajita"/>
+        </w:rPr>
+      </w:pPr>
+      <w:r>
+        <w:rPr>
+          <w:rFonts w:ascii="Aparajita" w:hAnsi="Aparajita" w:cs="Aparajita"/>
+        </w:rPr>
+        <w:t>Ice</w:t>
+      </w:r>
+      <w:r>
+        <w:rPr>
+          <w:rFonts w:ascii="Aparajita" w:hAnsi="Aparajita" w:cs="Aparajita"/>
+        </w:rPr>
+        <w:t xml:space="preserve"> trails the rock.</w:t>
+      </w:r>
+      <w:r>
+        <w:rPr>
+          <w:rFonts w:ascii="Aparajita" w:hAnsi="Aparajita" w:cs="Aparajita"/>
+        </w:rPr>
+        <w:br/>
+        <w:t>Crystals hole up.</w:t>
+      </w:r>
+      <w:r>
+        <w:rPr>
+          <w:rFonts w:ascii="Aparajita" w:hAnsi="Aparajita" w:cs="Aparajita"/>
+        </w:rPr>
+        <w:br/>
+        <w:t>Shapes pace the shape.</w:t>
+      </w:r>
+      <w:r>
+        <w:rPr>
+          <w:rFonts w:ascii="Aparajita" w:hAnsi="Aparajita" w:cs="Aparajita"/>
+        </w:rPr>
+        <w:br/>
+      </w:r>
+      <w:r>
+        <w:rPr>
+          <w:rFonts w:ascii="Aparajita" w:hAnsi="Aparajita" w:cs="Aparajita"/>
+        </w:rPr>
         <w:lastRenderedPageBreak/>
-        <w:t xml:space="preserve">From </w:t>
-      </w:r>
-      <w:r>
-        <w:rPr>
-          <w:rFonts w:ascii="Aparajita" w:hAnsi="Aparajita" w:cs="Aparajita"/>
-        </w:rPr>
-        <w:t>field to field</w:t>
-      </w:r>
-      <w:r>
-        <w:rPr>
-          <w:rFonts w:ascii="Aparajita" w:hAnsi="Aparajita" w:cs="Aparajita"/>
-        </w:rPr>
-        <w:t xml:space="preserve"> she navigated freely, to places she had frequented often;</w:t>
-      </w:r>
-      <w:r>
-        <w:rPr>
-          <w:rFonts w:ascii="Aparajita" w:hAnsi="Aparajita" w:cs="Aparajita"/>
-        </w:rPr>
-        <w:br/>
-        <w:t>Her grip slipped and she plunged downwards; she placidly bid this world adieu.</w:t>
-      </w:r>
-    </w:p>
-    <w:p>
-      <w:pPr>
-        <w:spacing w:after="0"/>
-        <w:rPr>
-          <w:rFonts w:ascii="Aparajita" w:hAnsi="Aparajita" w:cs="Aparajita"/>
-        </w:rPr>
-      </w:pPr>
-      <w:r>
-        <w:rPr>
-          <w:rFonts w:ascii="Aparajita" w:hAnsi="Aparajita" w:cs="Aparajita"/>
-        </w:rPr>
-        <w:br/>
-        <w:t>May the willows sway about her</w:t>
-      </w:r>
-      <w:r>
-        <w:rPr>
-          <w:rFonts w:ascii="Aparajita" w:hAnsi="Aparajita" w:cs="Aparajita"/>
-        </w:rPr>
-        <w:t xml:space="preserve">, </w:t>
-      </w:r>
-      <w:r>
-        <w:rPr>
-          <w:rFonts w:ascii="Aparajita" w:hAnsi="Aparajita" w:cs="Aparajita"/>
-        </w:rPr>
-        <w:t>and about the cultivated laurels,</w:t>
-      </w:r>
-      <w:r>
-        <w:rPr>
-          <w:rFonts w:ascii="Aparajita" w:hAnsi="Aparajita" w:cs="Aparajita"/>
-        </w:rPr>
-        <w:br/>
-        <w:t xml:space="preserve">May the sweet roses blossom at the extremities of the </w:t>
-      </w:r>
-      <w:r>
-        <w:rPr>
-          <w:rFonts w:ascii="Aparajita" w:hAnsi="Aparajita" w:cs="Aparajita"/>
-        </w:rPr>
-        <w:t>maiden; for one</w:t>
-      </w:r>
-      <w:r>
-        <w:rPr>
-          <w:rFonts w:ascii="Aparajita" w:hAnsi="Aparajita" w:cs="Aparajita"/>
-        </w:rPr>
-        <w:t xml:space="preserve"> was brave.</w:t>
-      </w:r>
-      <w:r>
-        <w:rPr>
-          <w:rFonts w:ascii="Aparajita" w:hAnsi="Aparajita" w:cs="Aparajita"/>
-        </w:rPr>
-        <w:br/>
-        <w:t>Her physical form rests buried in the soil, allow us trust her spirit is in ecstasy.</w:t>
-      </w:r>
-      <w:r>
-        <w:rPr>
-          <w:rFonts w:ascii="Aparajita" w:hAnsi="Aparajita" w:cs="Aparajita"/>
-        </w:rPr>
-        <w:br/>
-        <w:t>let us trust her spirit is in bliss.</w:t>
-      </w:r>
-      <w:r>
-        <w:rPr>
-          <w:rFonts w:ascii="Aparajita" w:hAnsi="Aparajita" w:cs="Aparajita"/>
-        </w:rPr>
-        <w:br/>
-        <w:t xml:space="preserve">Shed a single tear as a definitive parting to the nomadic </w:t>
-      </w:r>
-      <w:r>
-        <w:rPr>
-          <w:rFonts w:ascii="Aparajita" w:hAnsi="Aparajita" w:cs="Aparajita"/>
-        </w:rPr>
-        <w:t>sparrow</w:t>
-      </w:r>
+        <w:t>Mists sweep the mood.</w:t>
+      </w:r>
+      <w:r>
+        <w:rPr>
+          <w:rFonts w:ascii="Aparajita" w:hAnsi="Aparajita" w:cs="Aparajita"/>
+        </w:rPr>
+        <w:br/>
+        <w:t>Thickets rest.</w:t>
+      </w:r>
+      <w:r>
+        <w:rPr>
+          <w:rFonts w:ascii="Aparajita" w:hAnsi="Aparajita" w:cs="Aparajita"/>
+        </w:rPr>
+        <w:br/>
+        <w:t>Mists hold.</w:t>
+      </w:r>
+      <w:r>
+        <w:rPr>
+          <w:rFonts w:ascii="Aparajita" w:hAnsi="Aparajita" w:cs="Aparajita"/>
+        </w:rPr>
+        <w:br/>
+        <w:t xml:space="preserve">The cliff paces the </w:t>
+      </w:r>
+      <w:r>
+        <w:rPr>
+          <w:rFonts w:ascii="Aparajita" w:hAnsi="Aparajita" w:cs="Aparajita"/>
+        </w:rPr>
+        <w:t>sand</w:t>
+      </w:r>
+      <w:r>
+        <w:rPr>
+          <w:rFonts w:ascii="Aparajita" w:hAnsi="Aparajita" w:cs="Aparajita"/>
+        </w:rPr>
+        <w:t>.</w:t>
+      </w:r>
+      <w:r>
+        <w:rPr>
+          <w:rFonts w:ascii="Aparajita" w:hAnsi="Aparajita" w:cs="Aparajita"/>
+        </w:rPr>
+        <w:br/>
+        <w:t>Pursuing courage pulls the sages.</w:t>
+      </w:r>
+      <w:r>
+        <w:rPr>
+          <w:rFonts w:ascii="Aparajita" w:hAnsi="Aparajita" w:cs="Aparajita"/>
+        </w:rPr>
+        <w:br/>
+      </w:r>
+      <w:r>
+        <w:rPr>
+          <w:rFonts w:ascii="Aparajita" w:hAnsi="Aparajita" w:cs="Aparajita"/>
+        </w:rPr>
+        <w:t>Tongues</w:t>
+      </w:r>
+      <w:r>
+        <w:rPr>
+          <w:rFonts w:ascii="Aparajita" w:hAnsi="Aparajita" w:cs="Aparajita"/>
+        </w:rPr>
+        <w:t xml:space="preserve"> tastes the oozes.</w:t>
+      </w:r>
+    </w:p>
+    <w:p>
+      <w:pPr>
+        <w:spacing w:after="0"/>
+        <w:rPr>
+          <w:rFonts w:ascii="Aparajita" w:hAnsi="Aparajita" w:cs="Aparajita"/>
+        </w:rPr>
+      </w:pPr>
+      <w:r>
+        <w:rPr>
+          <w:rFonts w:ascii="Aparajita" w:hAnsi="Aparajita" w:cs="Aparajita"/>
+        </w:rPr>
+        <w:t>.</w:t>
+      </w:r>
+    </w:p>
+    <w:p>
+      <w:pPr>
+        <w:spacing w:after="0"/>
+        <w:rPr>
+          <w:rFonts w:ascii="Aparajita" w:hAnsi="Aparajita" w:cs="Aparajita"/>
+        </w:rPr>
+      </w:pPr>
+      <w:r>
+        <w:rPr>
+          <w:rFonts w:ascii="Aparajita" w:hAnsi="Aparajita" w:cs="Aparajita"/>
+        </w:rPr>
+        <w:t>8/2/26</w:t>
+      </w:r>
+    </w:p>
+    <w:p>
+      <w:pPr>
+        <w:spacing w:after="0"/>
+        <w:rPr>
+          <w:rFonts w:ascii="Aparajita" w:hAnsi="Aparajita" w:cs="Aparajita"/>
+        </w:rPr>
+      </w:pPr>
+      <w:r>
+        <w:rPr>
+          <w:rFonts w:ascii="Aparajita" w:hAnsi="Aparajita" w:cs="Aparajita"/>
+        </w:rPr>
+        <w:t>However, if—oh! If you are able to grant me immunity and a longer reign,</w:t>
+      </w:r>
+    </w:p>
+    <w:p>
+      <w:pPr>
+        <w:spacing w:after="0"/>
+        <w:rPr>
+          <w:rFonts w:ascii="Aparajita" w:hAnsi="Aparajita" w:cs="Aparajita"/>
+        </w:rPr>
+      </w:pPr>
+      <w:r>
+        <w:rPr>
+          <w:rFonts w:ascii="Aparajita" w:hAnsi="Aparajita" w:cs="Aparajita"/>
+        </w:rPr>
+        <w:t>If my growth would spare me, I would be willing to stay and have a beautiful, fair child that I would love to see married. if my growing would spare me. I would prefer to be there if you could just grant me this.</w:t>
+      </w:r>
+    </w:p>
+    <w:p>
+      <w:pPr>
+        <w:spacing w:after="0"/>
+        <w:rPr>
+          <w:rFonts w:ascii="Aparajita" w:hAnsi="Aparajita" w:cs="Aparajita"/>
+        </w:rPr>
+      </w:pPr>
+      <w:r>
+        <w:rPr>
+          <w:rFonts w:ascii="Aparajita" w:hAnsi="Aparajita" w:cs="Aparajita"/>
+        </w:rPr>
+        <w:t>.</w:t>
+      </w:r>
+    </w:p>
+    <w:p>
+      <w:pPr>
+        <w:spacing w:after="0"/>
+        <w:rPr>
+          <w:rFonts w:ascii="Aparajita" w:hAnsi="Aparajita" w:cs="Aparajita"/>
+        </w:rPr>
+      </w:pPr>
+      <w:r>
+        <w:rPr>
+          <w:rFonts w:ascii="Aparajita" w:hAnsi="Aparajita" w:cs="Aparajita"/>
+        </w:rPr>
+        <w:t>7/4/26</w:t>
+      </w:r>
+    </w:p>
+    <w:p>
+      <w:pPr>
+        <w:spacing w:after="0"/>
+        <w:rPr>
+          <w:rFonts w:ascii="Aparajita" w:hAnsi="Aparajita" w:cs="Aparajita"/>
+        </w:rPr>
+      </w:pPr>
+      <w:r>
+        <w:rPr>
+          <w:rFonts w:ascii="Aparajita" w:hAnsi="Aparajita" w:cs="Aparajita"/>
+        </w:rPr>
+        <w:t xml:space="preserve">against all willow  </w:t>
+      </w:r>
+    </w:p>
+    <w:p>
+      <w:pPr>
+        <w:spacing w:after="0"/>
+        <w:rPr>
+          <w:rFonts w:ascii="Aparajita" w:hAnsi="Aparajita" w:cs="Aparajita"/>
+        </w:rPr>
+      </w:pPr>
+      <w:r>
+        <w:rPr>
+          <w:rFonts w:ascii="Aparajita" w:hAnsi="Aparajita" w:cs="Aparajita"/>
+        </w:rPr>
+        <w:t xml:space="preserve">all all willow  </w:t>
+      </w:r>
+    </w:p>
+    <w:p>
+      <w:pPr>
+        <w:spacing w:after="0"/>
+        <w:rPr>
+          <w:rFonts w:ascii="Aparajita" w:hAnsi="Aparajita" w:cs="Aparajita"/>
+        </w:rPr>
+      </w:pPr>
+      <w:r>
+        <w:rPr>
+          <w:rFonts w:ascii="Aparajita" w:hAnsi="Aparajita" w:cs="Aparajita"/>
+        </w:rPr>
+        <w:t xml:space="preserve">my my  </w:t>
+      </w:r>
+    </w:p>
+    <w:p>
+      <w:pPr>
+        <w:spacing w:after="0"/>
+        <w:rPr>
+          <w:rFonts w:ascii="Aparajita" w:hAnsi="Aparajita" w:cs="Aparajita"/>
+        </w:rPr>
+      </w:pPr>
+      <w:r>
+        <w:rPr>
+          <w:rFonts w:ascii="Aparajita" w:hAnsi="Aparajita" w:cs="Aparajita"/>
+        </w:rPr>
+        <w:t xml:space="preserve">my my  </w:t>
+      </w:r>
+    </w:p>
+    <w:p>
+      <w:pPr>
+        <w:spacing w:after="0"/>
+        <w:rPr>
+          <w:rFonts w:ascii="Aparajita" w:hAnsi="Aparajita" w:cs="Aparajita"/>
+        </w:rPr>
+      </w:pPr>
+      <w:r>
+        <w:rPr>
+          <w:rFonts w:ascii="Aparajita" w:hAnsi="Aparajita" w:cs="Aparajita"/>
+        </w:rPr>
+        <w:t xml:space="preserve">up knock underneath underneath underneath garment underneath underneath underneath underneath  </w:t>
+      </w:r>
+    </w:p>
+    <w:p>
+      <w:pPr>
+        <w:spacing w:after="0"/>
+        <w:rPr>
+          <w:rFonts w:ascii="Aparajita" w:hAnsi="Aparajita" w:cs="Aparajita"/>
+        </w:rPr>
+      </w:pPr>
+      <w:r>
+        <w:rPr>
+          <w:rFonts w:ascii="Aparajita" w:hAnsi="Aparajita" w:cs="Aparajita"/>
+        </w:rPr>
+        <w:t xml:space="preserve">the That the  </w:t>
+      </w:r>
+    </w:p>
+    <w:p>
+      <w:pPr>
+        <w:spacing w:after="0"/>
+        <w:rPr>
+          <w:rFonts w:ascii="Aparajita" w:hAnsi="Aparajita" w:cs="Aparajita"/>
+        </w:rPr>
+      </w:pPr>
+      <w:r>
+        <w:rPr>
+          <w:rFonts w:ascii="Aparajita" w:hAnsi="Aparajita" w:cs="Aparajita"/>
+        </w:rPr>
+        <w:t xml:space="preserve">hammer he  </w:t>
+      </w:r>
+    </w:p>
+    <w:p>
+      <w:pPr>
+        <w:spacing w:after="0"/>
+        <w:rPr>
+          <w:rFonts w:ascii="Aparajita" w:hAnsi="Aparajita" w:cs="Aparajita"/>
+        </w:rPr>
+      </w:pPr>
+      <w:r>
+        <w:rPr>
+          <w:rFonts w:ascii="Aparajita" w:hAnsi="Aparajita" w:cs="Aparajita"/>
+        </w:rPr>
+        <w:t xml:space="preserve">the Oh the  </w:t>
+      </w:r>
+    </w:p>
+    <w:p>
+      <w:pPr>
+        <w:spacing w:after="0"/>
+        <w:rPr>
+          <w:rFonts w:ascii="Aparajita" w:hAnsi="Aparajita" w:cs="Aparajita"/>
+        </w:rPr>
+      </w:pPr>
+      <w:r>
+        <w:rPr>
+          <w:rFonts w:ascii="Aparajita" w:hAnsi="Aparajita" w:cs="Aparajita"/>
+        </w:rPr>
+        <w:t xml:space="preserve">No howl  </w:t>
+      </w:r>
+    </w:p>
+    <w:p>
+      <w:pPr>
+        <w:spacing w:after="0"/>
+        <w:rPr>
+          <w:rFonts w:ascii="Aparajita" w:hAnsi="Aparajita" w:cs="Aparajita"/>
+        </w:rPr>
+      </w:pPr>
+      <w:r>
+        <w:rPr>
+          <w:rFonts w:ascii="Aparajita" w:hAnsi="Aparajita" w:cs="Aparajita"/>
+        </w:rPr>
+        <w:t xml:space="preserve">parsley hammer ward parsley snugly parsley parsley  </w:t>
+      </w:r>
+    </w:p>
+    <w:p>
+      <w:pPr>
+        <w:spacing w:after="0"/>
+        <w:rPr>
+          <w:rFonts w:ascii="Aparajita" w:hAnsi="Aparajita" w:cs="Aparajita"/>
+        </w:rPr>
+      </w:pPr>
+      <w:r>
+        <w:rPr>
+          <w:rFonts w:ascii="Aparajita" w:hAnsi="Aparajita" w:cs="Aparajita"/>
+        </w:rPr>
+        <w:t xml:space="preserve">all or tucked underneath underneath  </w:t>
+      </w:r>
+    </w:p>
+    <w:p>
+      <w:pPr>
+        <w:spacing w:after="0"/>
+        <w:rPr>
+          <w:rFonts w:ascii="Aparajita" w:hAnsi="Aparajita" w:cs="Aparajita"/>
+        </w:rPr>
+      </w:pPr>
+      <w:r>
+        <w:rPr>
+          <w:rFonts w:ascii="Aparajita" w:hAnsi="Aparajita" w:cs="Aparajita"/>
+        </w:rPr>
+        <w:t xml:space="preserve">the tucked tucked tucked garment tucked  </w:t>
+      </w:r>
+    </w:p>
+    <w:p>
+      <w:pPr>
+        <w:spacing w:after="0"/>
+        <w:rPr>
+          <w:rFonts w:ascii="Aparajita" w:hAnsi="Aparajita" w:cs="Aparajita"/>
+        </w:rPr>
+      </w:pPr>
+      <w:r>
+        <w:rPr>
+          <w:rFonts w:ascii="Aparajita" w:hAnsi="Aparajita" w:cs="Aparajita"/>
+        </w:rPr>
+        <w:t xml:space="preserve">at or tucked underneath underneath  </w:t>
+      </w:r>
+    </w:p>
+    <w:p>
+      <w:pPr>
+        <w:spacing w:after="0"/>
+        <w:rPr>
+          <w:rFonts w:ascii="Aparajita" w:hAnsi="Aparajita" w:cs="Aparajita"/>
+        </w:rPr>
+      </w:pPr>
+      <w:r>
+        <w:rPr>
+          <w:rFonts w:ascii="Aparajita" w:hAnsi="Aparajita" w:cs="Aparajita"/>
+        </w:rPr>
+        <w:t xml:space="preserve">against against That against against against garment  </w:t>
+      </w:r>
+    </w:p>
+    <w:p>
+      <w:pPr>
+        <w:spacing w:after="0"/>
+        <w:rPr>
+          <w:rFonts w:ascii="Aparajita" w:hAnsi="Aparajita" w:cs="Aparajita"/>
+        </w:rPr>
+      </w:pPr>
+      <w:r>
+        <w:rPr>
+          <w:rFonts w:ascii="Aparajita" w:hAnsi="Aparajita" w:cs="Aparajita"/>
+        </w:rPr>
+        <w:t xml:space="preserve">the the the  </w:t>
+      </w:r>
+    </w:p>
+    <w:p>
+      <w:pPr>
+        <w:spacing w:after="0"/>
+        <w:rPr>
+          <w:rFonts w:ascii="Aparajita" w:hAnsi="Aparajita" w:cs="Aparajita"/>
+        </w:rPr>
+      </w:pPr>
+      <w:r>
+        <w:rPr>
+          <w:rFonts w:ascii="Aparajita" w:hAnsi="Aparajita" w:cs="Aparajita"/>
+        </w:rPr>
+        <w:t xml:space="preserve">the the the  </w:t>
+      </w:r>
+    </w:p>
+    <w:p>
+      <w:pPr>
+        <w:spacing w:after="0"/>
+        <w:rPr>
+          <w:rFonts w:ascii="Aparajita" w:hAnsi="Aparajita" w:cs="Aparajita"/>
+        </w:rPr>
+      </w:pPr>
+      <w:r>
+        <w:rPr>
+          <w:rFonts w:ascii="Aparajita" w:hAnsi="Aparajita" w:cs="Aparajita"/>
+        </w:rPr>
+        <w:t xml:space="preserve">the the the  </w:t>
+      </w:r>
+    </w:p>
+    <w:p>
+      <w:pPr>
+        <w:spacing w:after="0"/>
+        <w:rPr>
+          <w:rFonts w:ascii="Aparajita" w:hAnsi="Aparajita" w:cs="Aparajita"/>
+        </w:rPr>
+      </w:pPr>
+      <w:r>
+        <w:rPr>
+          <w:rFonts w:ascii="Aparajita" w:hAnsi="Aparajita" w:cs="Aparajita"/>
+        </w:rPr>
+        <w:t xml:space="preserve">ward garment was  </w:t>
+      </w:r>
+    </w:p>
+    <w:p>
+      <w:pPr>
+        <w:spacing w:after="0"/>
+        <w:rPr>
+          <w:rFonts w:ascii="Aparajita" w:hAnsi="Aparajita" w:cs="Aparajita"/>
+        </w:rPr>
+      </w:pPr>
+      <w:r>
+        <w:rPr>
+          <w:rFonts w:ascii="Aparajita" w:hAnsi="Aparajita" w:cs="Aparajita"/>
+        </w:rPr>
+        <w:t xml:space="preserve">howl No howl willow  </w:t>
+      </w:r>
+    </w:p>
+    <w:p>
+      <w:pPr>
+        <w:spacing w:after="0"/>
+        <w:rPr>
+          <w:rFonts w:ascii="Aparajita" w:hAnsi="Aparajita" w:cs="Aparajita"/>
+        </w:rPr>
+      </w:pPr>
+      <w:r>
+        <w:rPr>
+          <w:rFonts w:ascii="Aparajita" w:hAnsi="Aparajita" w:cs="Aparajita"/>
+        </w:rPr>
+        <w:t xml:space="preserve">ward garment parsley ward  </w:t>
+      </w:r>
+    </w:p>
+    <w:p>
+      <w:pPr>
+        <w:spacing w:after="0"/>
+        <w:rPr>
+          <w:rFonts w:ascii="Aparajita" w:hAnsi="Aparajita" w:cs="Aparajita"/>
+        </w:rPr>
+      </w:pPr>
+      <w:r>
+        <w:rPr>
+          <w:rFonts w:ascii="Aparajita" w:hAnsi="Aparajita" w:cs="Aparajita"/>
+        </w:rPr>
+        <w:t xml:space="preserve">parsley hammer ward parsley snugly parsley parsley  </w:t>
+      </w:r>
+    </w:p>
+    <w:p>
+      <w:pPr>
+        <w:spacing w:after="0"/>
+        <w:rPr>
+          <w:rFonts w:ascii="Aparajita" w:hAnsi="Aparajita" w:cs="Aparajita"/>
+        </w:rPr>
+      </w:pPr>
       <w:r>
         <w:rPr>
           <w:rFonts w:ascii="Aparajita" w:hAnsi="Aparajita" w:cs="Aparajita"/>
@@ -1162,6 +2128,56 @@
     </w:sectPr>
   </w:body>
 </w:document>
+</file>
+
+<file path=word/endnotes.xml><?xml version="1.0" encoding="utf-8"?>
+<w:endnotes xmlns:wpc="http://schemas.microsoft.com/office/word/2010/wordprocessingCanvas" xmlns:cx="http://schemas.microsoft.com/office/drawing/2014/chartex" xmlns:cx1="http://schemas.microsoft.com/office/drawing/2015/9/8/chartex" xmlns:cx2="http://schemas.microsoft.com/office/drawing/2015/10/21/chartex" xmlns:cx3="http://schemas.microsoft.com/office/drawing/2016/5/9/chartex" xmlns:cx4="http://schemas.microsoft.com/office/drawing/2016/5/10/chartex" xmlns:cx5="http://schemas.microsoft.com/office/drawing/2016/5/11/chartex" xmlns:cx6="http://schemas.microsoft.com/office/drawing/2016/5/12/chartex" xmlns:cx7="http://schemas.microsoft.com/office/drawing/2016/5/13/chartex" xmlns:cx8="http://schemas.microsoft.com/office/drawing/2016/5/14/chartex" xmlns:mc="http://schemas.openxmlformats.org/markup-compatibility/2006" xmlns:aink="http://schemas.microsoft.com/office/drawing/2016/ink" xmlns:am3d="http://schemas.microsoft.com/office/drawing/2017/model3d" xmlns:o="urn:schemas-microsoft-com:office:office" xmlns:oel="http://schemas.microsoft.com/office/2019/extlst" xmlns:r="http://schemas.openxmlformats.org/officeDocument/2006/relationships" xmlns:m="http://schemas.openxmlformats.org/officeDocument/2006/math" xmlns:v="urn:schemas-microsoft-com:vml" xmlns:wp14="http://schemas.microsoft.com/office/word/2010/wordprocessingDrawing" xmlns:wp="http://schemas.openxmlformats.org/drawingml/2006/wordprocessingDrawing" xmlns:w10="urn:schemas-microsoft-com:office:word" xmlns:w="http://schemas.openxmlformats.org/wordprocessingml/2006/main" xmlns:w14="http://schemas.microsoft.com/office/word/2010/wordml" xmlns:w15="http://schemas.microsoft.com/office/word/2012/wordml" xmlns:w16cei="http://schemas.microsoft.com/office/word/2026/wordml/cei" xmlns:w16cex="http://schemas.microsoft.com/office/word/2018/wordml/cex" xmlns:w16cid="http://schemas.microsoft.com/office/word/2016/wordml/cid" xmlns:w16="http://schemas.microsoft.com/office/word/2018/wordml" xmlns:w16du="http://schemas.microsoft.com/office/word/2023/wordml/word16du" xmlns:w16sdtdh="http://schemas.microsoft.com/office/word/2020/wordml/sdtdatahash" xmlns:w16sdtfl="http://schemas.microsoft.com/office/word/2024/wordml/sdtformatlock" xmlns:w16se="http://schemas.microsoft.com/office/word/2015/wordml/symex" xmlns:wpg="http://schemas.microsoft.com/office/word/2010/wordprocessingGroup" xmlns:wpi="http://schemas.microsoft.com/office/word/2010/wordprocessingInk" xmlns:wne="http://schemas.microsoft.com/office/word/2006/wordml" xmlns:wps="http://schemas.microsoft.com/office/word/2010/wordprocessingShape" mc:Ignorable="w14 w15 w16se w16cid w16 w16cex w16sdtdh w16sdtfl w16du wp14">
+  <w:endnote w:type="separator" w:id="-1">
+    <w:p>
+      <w:pPr>
+        <w:spacing w:after="0" w:line="240" w:lineRule="auto"/>
+      </w:pPr>
+      <w:r>
+        <w:separator/>
+      </w:r>
+    </w:p>
+  </w:endnote>
+  <w:endnote w:type="continuationSeparator" w:id="0">
+    <w:p>
+      <w:pPr>
+        <w:spacing w:after="0" w:line="240" w:lineRule="auto"/>
+      </w:pPr>
+      <w:r>
+        <w:continuationSeparator/>
+      </w:r>
+    </w:p>
+  </w:endnote>
+</w:endnotes>
+</file>
+
+<file path=word/footnotes.xml><?xml version="1.0" encoding="utf-8"?>
+<w:footnotes xmlns:wpc="http://schemas.microsoft.com/office/word/2010/wordprocessingCanvas" xmlns:cx="http://schemas.microsoft.com/office/drawing/2014/chartex" xmlns:cx1="http://schemas.microsoft.com/office/drawing/2015/9/8/chartex" xmlns:cx2="http://schemas.microsoft.com/office/drawing/2015/10/21/chartex" xmlns:cx3="http://schemas.microsoft.com/office/drawing/2016/5/9/chartex" xmlns:cx4="http://schemas.microsoft.com/office/drawing/2016/5/10/chartex" xmlns:cx5="http://schemas.microsoft.com/office/drawing/2016/5/11/chartex" xmlns:cx6="http://schemas.microsoft.com/office/drawing/2016/5/12/chartex" xmlns:cx7="http://schemas.microsoft.com/office/drawing/2016/5/13/chartex" xmlns:cx8="http://schemas.microsoft.com/office/drawing/2016/5/14/chartex" xmlns:mc="http://schemas.openxmlformats.org/markup-compatibility/2006" xmlns:aink="http://schemas.microsoft.com/office/drawing/2016/ink" xmlns:am3d="http://schemas.microsoft.com/office/drawing/2017/model3d" xmlns:o="urn:schemas-microsoft-com:office:office" xmlns:oel="http://schemas.microsoft.com/office/2019/extlst" xmlns:r="http://schemas.openxmlformats.org/officeDocument/2006/relationships" xmlns:m="http://schemas.openxmlformats.org/officeDocument/2006/math" xmlns:v="urn:schemas-microsoft-com:vml" xmlns:wp14="http://schemas.microsoft.com/office/word/2010/wordprocessingDrawing" xmlns:wp="http://schemas.openxmlformats.org/drawingml/2006/wordprocessingDrawing" xmlns:w10="urn:schemas-microsoft-com:office:word" xmlns:w="http://schemas.openxmlformats.org/wordprocessingml/2006/main" xmlns:w14="http://schemas.microsoft.com/office/word/2010/wordml" xmlns:w15="http://schemas.microsoft.com/office/word/2012/wordml" xmlns:w16cei="http://schemas.microsoft.com/office/word/2026/wordml/cei" xmlns:w16cex="http://schemas.microsoft.com/office/word/2018/wordml/cex" xmlns:w16cid="http://schemas.microsoft.com/office/word/2016/wordml/cid" xmlns:w16="http://schemas.microsoft.com/office/word/2018/wordml" xmlns:w16du="http://schemas.microsoft.com/office/word/2023/wordml/word16du" xmlns:w16sdtdh="http://schemas.microsoft.com/office/word/2020/wordml/sdtdatahash" xmlns:w16sdtfl="http://schemas.microsoft.com/office/word/2024/wordml/sdtformatlock" xmlns:w16se="http://schemas.microsoft.com/office/word/2015/wordml/symex" xmlns:wpg="http://schemas.microsoft.com/office/word/2010/wordprocessingGroup" xmlns:wpi="http://schemas.microsoft.com/office/word/2010/wordprocessingInk" xmlns:wne="http://schemas.microsoft.com/office/word/2006/wordml" xmlns:wps="http://schemas.microsoft.com/office/word/2010/wordprocessingShape" mc:Ignorable="w14 w15 w16se w16cid w16 w16cex w16sdtdh w16sdtfl w16du wp14">
+  <w:footnote w:type="separator" w:id="-1">
+    <w:p>
+      <w:pPr>
+        <w:spacing w:after="0" w:line="240" w:lineRule="auto"/>
+      </w:pPr>
+      <w:r>
+        <w:separator/>
+      </w:r>
+    </w:p>
+  </w:footnote>
+  <w:footnote w:type="continuationSeparator" w:id="0">
+    <w:p>
+      <w:pPr>
+        <w:spacing w:after="0" w:line="240" w:lineRule="auto"/>
+      </w:pPr>
+      <w:r>
+        <w:continuationSeparator/>
+      </w:r>
+    </w:p>
+  </w:footnote>
+</w:footnotes>
 </file>
 
 <file path=word/styles.xml><?xml version="1.0" encoding="utf-8"?>
@@ -2091,6 +3107,50 @@
       <w:rFonts w:ascii="Times New Roman" w:hAnsi="Times New Roman" w:cs="Times New Roman"/>
     </w:rPr>
   </w:style>
+  <w:style w:type="paragraph" w:styleId="Header">
+    <w:name w:val="header"/>
+    <w:basedOn w:val="Normal"/>
+    <w:link w:val="HeaderChar"/>
+    <w:uiPriority w:val="99"/>
+    <w:unhideWhenUsed/>
+    <w:rsid w:val="00A96D7F"/>
+    <w:pPr>
+      <w:tabs>
+        <w:tab w:val="center" w:pos="4680"/>
+        <w:tab w:val="right" w:pos="9360"/>
+      </w:tabs>
+      <w:spacing w:after="0" w:line="240" w:lineRule="auto"/>
+    </w:pPr>
+  </w:style>
+  <w:style w:type="character" w:customStyle="1" w:styleId="HeaderChar">
+    <w:name w:val="Header Char"/>
+    <w:basedOn w:val="DefaultParagraphFont"/>
+    <w:link w:val="Header"/>
+    <w:uiPriority w:val="99"/>
+    <w:rsid w:val="00A96D7F"/>
+  </w:style>
+  <w:style w:type="paragraph" w:styleId="Footer">
+    <w:name w:val="footer"/>
+    <w:basedOn w:val="Normal"/>
+    <w:link w:val="FooterChar"/>
+    <w:uiPriority w:val="99"/>
+    <w:unhideWhenUsed/>
+    <w:rsid w:val="00A96D7F"/>
+    <w:pPr>
+      <w:tabs>
+        <w:tab w:val="center" w:pos="4680"/>
+        <w:tab w:val="right" w:pos="9360"/>
+      </w:tabs>
+      <w:spacing w:after="0" w:line="240" w:lineRule="auto"/>
+    </w:pPr>
+  </w:style>
+  <w:style w:type="character" w:customStyle="1" w:styleId="FooterChar">
+    <w:name w:val="Footer Char"/>
+    <w:basedOn w:val="DefaultParagraphFont"/>
+    <w:link w:val="Footer"/>
+    <w:uiPriority w:val="99"/>
+    <w:rsid w:val="00A96D7F"/>
+  </w:style>
 </w:styles>
 </file>
 

</xml_diff>

<commit_message>
Add two more poems from poetry.docx, tweak ballad's opening line
New: 2026-08-05 ("Two hours before the day..."), now the newest text
entry, and a second 2026-07-04 poem ("When I was sinking down...")
placed after the existing glitch-style poem from that same date.

The Abersoch ballad's opening line changed again in the source
("Hark, all maids" -> "Hark, all") since it was last synced; updated
to match.

Co-Authored-By: Claude Sonnet 5 <noreply@anthropic.com>
</commit_message>
<xml_diff>
--- a/text/poetry/poetry.docx
+++ b/text/poetry/poetry.docx
@@ -888,19 +888,7 @@
         <w:rPr>
           <w:rFonts w:ascii="Aparajita" w:hAnsi="Aparajita" w:cs="Aparajita"/>
         </w:rPr>
-        <w:t>Hark, all</w:t>
-      </w:r>
-      <w:r>
-        <w:rPr>
-          <w:rFonts w:ascii="Aparajita" w:hAnsi="Aparajita" w:cs="Aparajita"/>
-        </w:rPr>
-        <w:t xml:space="preserve"> maids</w:t>
-      </w:r>
-      <w:r>
-        <w:rPr>
-          <w:rFonts w:ascii="Aparajita" w:hAnsi="Aparajita" w:cs="Aparajita"/>
-        </w:rPr>
-        <w:t>, near and distant, and attend to my ballad;</w:t>
+        <w:t>Hark, all, near and distant, and attend to my ballad;</w:t>
       </w:r>
       <w:r>
         <w:rPr>
@@ -2119,6 +2107,245 @@
           <w:rFonts w:ascii="Aparajita" w:hAnsi="Aparajita" w:cs="Aparajita"/>
         </w:rPr>
       </w:pPr>
+      <w:r>
+        <w:rPr>
+          <w:rFonts w:ascii="Aparajita" w:hAnsi="Aparajita" w:cs="Aparajita"/>
+        </w:rPr>
+        <w:t>8/5/26</w:t>
+      </w:r>
+    </w:p>
+    <w:p>
+      <w:pPr>
+        <w:spacing w:after="0"/>
+        <w:rPr>
+          <w:rFonts w:ascii="Aparajita" w:hAnsi="Aparajita" w:cs="Aparajita"/>
+        </w:rPr>
+      </w:pPr>
+      <w:r>
+        <w:rPr>
+          <w:rFonts w:ascii="Aparajita" w:hAnsi="Aparajita" w:cs="Aparajita"/>
+        </w:rPr>
+        <w:t>Two hours before the day,</w:t>
+      </w:r>
+    </w:p>
+    <w:p>
+      <w:pPr>
+        <w:spacing w:after="0"/>
+        <w:rPr>
+          <w:rFonts w:ascii="Aparajita" w:hAnsi="Aparajita" w:cs="Aparajita"/>
+        </w:rPr>
+      </w:pPr>
+      <w:r>
+        <w:rPr>
+          <w:rFonts w:ascii="Aparajita" w:hAnsi="Aparajita" w:cs="Aparajita"/>
+        </w:rPr>
+        <w:t xml:space="preserve">upon thine </w:t>
+      </w:r>
+      <w:r>
+        <w:rPr>
+          <w:rFonts w:ascii="Aparajita" w:hAnsi="Aparajita" w:cs="Aparajita"/>
+        </w:rPr>
+        <w:t>cold ground</w:t>
+      </w:r>
+      <w:r>
+        <w:rPr>
+          <w:rFonts w:ascii="Aparajita" w:hAnsi="Aparajita" w:cs="Aparajita"/>
+        </w:rPr>
+        <w:t>,</w:t>
+      </w:r>
+    </w:p>
+    <w:p>
+      <w:pPr>
+        <w:spacing w:after="0"/>
+        <w:rPr>
+          <w:rFonts w:ascii="Aparajita" w:hAnsi="Aparajita" w:cs="Aparajita"/>
+        </w:rPr>
+      </w:pPr>
+      <w:r>
+        <w:rPr>
+          <w:rFonts w:ascii="Aparajita" w:hAnsi="Aparajita" w:cs="Aparajita"/>
+        </w:rPr>
+        <w:t>I d</w:t>
+      </w:r>
+      <w:r>
+        <w:rPr>
+          <w:rFonts w:ascii="Aparajita" w:hAnsi="Aparajita" w:cs="Aparajita"/>
+        </w:rPr>
+        <w:t>id</w:t>
+      </w:r>
+      <w:r>
+        <w:rPr>
+          <w:rFonts w:ascii="Aparajita" w:hAnsi="Aparajita" w:cs="Aparajita"/>
+        </w:rPr>
+        <w:t xml:space="preserve"> not intend to stay long in this place.</w:t>
+      </w:r>
+    </w:p>
+    <w:p>
+      <w:pPr>
+        <w:spacing w:after="0"/>
+        <w:rPr>
+          <w:rFonts w:ascii="Aparajita" w:hAnsi="Aparajita" w:cs="Aparajita"/>
+        </w:rPr>
+      </w:pPr>
+      <w:r>
+        <w:rPr>
+          <w:rFonts w:ascii="Aparajita" w:hAnsi="Aparajita" w:cs="Aparajita"/>
+        </w:rPr>
+        <w:lastRenderedPageBreak/>
+        <w:t>Her gown wouldn’t meet nor her apron strings tie</w:t>
+      </w:r>
+      <w:r>
+        <w:rPr>
+          <w:rFonts w:ascii="Aparajita" w:hAnsi="Aparajita" w:cs="Aparajita"/>
+        </w:rPr>
+        <w:t>, and</w:t>
+      </w:r>
+    </w:p>
+    <w:p>
+      <w:pPr>
+        <w:spacing w:after="0"/>
+        <w:rPr>
+          <w:rFonts w:ascii="Aparajita" w:hAnsi="Aparajita" w:cs="Aparajita"/>
+        </w:rPr>
+      </w:pPr>
+      <w:r>
+        <w:rPr>
+          <w:rFonts w:ascii="Aparajita" w:hAnsi="Aparajita" w:cs="Aparajita"/>
+        </w:rPr>
+        <w:t>Twas down in yonder garden green,</w:t>
+      </w:r>
+    </w:p>
+    <w:p>
+      <w:pPr>
+        <w:spacing w:after="0"/>
+        <w:rPr>
+          <w:rFonts w:ascii="Aparajita" w:hAnsi="Aparajita" w:cs="Aparajita"/>
+        </w:rPr>
+      </w:pPr>
+      <w:r>
+        <w:rPr>
+          <w:rFonts w:ascii="Aparajita" w:hAnsi="Aparajita" w:cs="Aparajita"/>
+        </w:rPr>
+        <w:t>What wondrous love, oh my soul, oh my soul</w:t>
+      </w:r>
+      <w:r>
+        <w:rPr>
+          <w:rFonts w:ascii="Aparajita" w:hAnsi="Aparajita" w:cs="Aparajita"/>
+        </w:rPr>
+        <w:t>.</w:t>
+      </w:r>
+    </w:p>
+    <w:p>
+      <w:pPr>
+        <w:spacing w:after="0"/>
+        <w:rPr>
+          <w:rFonts w:ascii="Aparajita" w:hAnsi="Aparajita" w:cs="Aparajita"/>
+        </w:rPr>
+      </w:pPr>
+      <w:r>
+        <w:rPr>
+          <w:rFonts w:ascii="Aparajita" w:hAnsi="Aparajita" w:cs="Aparajita"/>
+        </w:rPr>
+        <w:t>.</w:t>
+      </w:r>
+    </w:p>
+    <w:p>
+      <w:pPr>
+        <w:spacing w:after="0"/>
+        <w:rPr>
+          <w:rFonts w:ascii="Aparajita" w:hAnsi="Aparajita" w:cs="Aparajita"/>
+        </w:rPr>
+      </w:pPr>
+      <w:r>
+        <w:rPr>
+          <w:rFonts w:ascii="Aparajita" w:hAnsi="Aparajita" w:cs="Aparajita"/>
+        </w:rPr>
+        <w:t>7/4/26</w:t>
+      </w:r>
+    </w:p>
+    <w:p>
+      <w:pPr>
+        <w:spacing w:after="0"/>
+        <w:rPr>
+          <w:rFonts w:ascii="Aparajita" w:hAnsi="Aparajita" w:cs="Aparajita"/>
+        </w:rPr>
+      </w:pPr>
+      <w:r>
+        <w:rPr>
+          <w:rFonts w:ascii="Aparajita" w:hAnsi="Aparajita" w:cs="Aparajita"/>
+        </w:rPr>
+        <w:t>When I was sinking down, sinking down, sinking down,</w:t>
+      </w:r>
+      <w:r>
+        <w:rPr>
+          <w:rFonts w:ascii="Aparajita" w:hAnsi="Aparajita" w:cs="Aparajita"/>
+        </w:rPr>
+        <w:br/>
+        <w:t>When I was sinking down, sinking down,</w:t>
+      </w:r>
+    </w:p>
+    <w:p>
+      <w:pPr>
+        <w:spacing w:after="0"/>
+        <w:rPr>
+          <w:rFonts w:ascii="Aparajita" w:hAnsi="Aparajita" w:cs="Aparajita"/>
+        </w:rPr>
+      </w:pPr>
+      <w:r>
+        <w:rPr>
+          <w:rFonts w:ascii="Aparajita" w:hAnsi="Aparajita" w:cs="Aparajita"/>
+        </w:rPr>
+        <w:t>sinking down, sinking down, sinking down,</w:t>
+      </w:r>
+      <w:r>
+        <w:rPr>
+          <w:rFonts w:ascii="Aparajita" w:hAnsi="Aparajita" w:cs="Aparajita"/>
+        </w:rPr>
+        <w:br/>
+        <w:t>When I was sinking down, sinking down,</w:t>
+      </w:r>
+    </w:p>
+    <w:p>
+      <w:pPr>
+        <w:spacing w:after="0"/>
+        <w:rPr>
+          <w:rFonts w:ascii="Aparajita" w:hAnsi="Aparajita" w:cs="Aparajita"/>
+        </w:rPr>
+      </w:pPr>
+      <w:r>
+        <w:rPr>
+          <w:rFonts w:ascii="Aparajita" w:hAnsi="Aparajita" w:cs="Aparajita"/>
+        </w:rPr>
+        <w:t>sinking down, sinking down, sinking down,</w:t>
+      </w:r>
+      <w:r>
+        <w:rPr>
+          <w:rFonts w:ascii="Aparajita" w:hAnsi="Aparajita" w:cs="Aparajita"/>
+        </w:rPr>
+        <w:br/>
+        <w:t>When I was sinking down, sinking down,</w:t>
+      </w:r>
+    </w:p>
+    <w:p>
+      <w:pPr>
+        <w:spacing w:after="0"/>
+        <w:rPr>
+          <w:rFonts w:ascii="Aparajita" w:hAnsi="Aparajita" w:cs="Aparajita"/>
+        </w:rPr>
+      </w:pPr>
+      <w:r>
+        <w:rPr>
+          <w:rFonts w:ascii="Aparajita" w:hAnsi="Aparajita" w:cs="Aparajita"/>
+        </w:rPr>
+        <w:t>every time that you pass by</w:t>
+      </w:r>
+      <w:r>
+        <w:rPr>
+          <w:rFonts w:ascii="Aparajita" w:hAnsi="Aparajita" w:cs="Aparajita"/>
+        </w:rPr>
+        <w:br/>
+        <w:t>I’ll wish you were away.</w:t>
+      </w:r>
     </w:p>
     <w:sectPr>
       <w:pgSz w:w="12240" w:h="15840"/>

</xml_diff>